<commit_message>
Add per-load variant and extra validation checks; tighten report wording
</commit_message>
<xml_diff>
--- a/reports/Freight_Rate_Report.docx
+++ b/reports/Freight_Rate_Report.docx
@@ -25,7 +25,7 @@
     </w:p>
     <w:p>
       <w:r>
-        <w:t>The final model is a gradient-boosted tree model on log(rate) for the load-specific part (distance, pickup/delivery location, equipment, weight, quote_signal), plus a small linear term for the market level and a time trend. On out-of-time validation (train on the past, predict the next two months, five times) it averages 2.08% MAPE / $48 MAE, compared with 2.62% / $61 for the same GBM without the linear term. The final model was retrained on all clean January to October loads before predicting November and December.</w:t>
+        <w:t>The final model is a gradient-boosted tree model on log(rate) for the load-specific part (distance, pickup/delivery location, equipment, weight, quote_signal), plus a small linear term for the market level and a time trend. On out-of-time validation (train on the past, predict the next two months, five times) it averages 2.08% MAPE / $48 MAE, compared with 2.62% / $61 for the same GBM without the linear term. The final model was retrained on all clean January to October loads before predicting November and December. These windows were also what I used to choose the model, so treat the numbers as selection results, not an untouched test (more on that in section 2).</w:t>
       </w:r>
     </w:p>
     <w:p>
@@ -43,7 +43,12 @@
     </w:p>
     <w:p>
       <w:r>
-        <w:t>I used a rolling-origin (expanding window) split. For each cutoff from 1 May to 1 Sep, the model is trained on every load before the cutoff and tested on the two calendar months after it. That gives five test windows (May-Jun through Sep-Oct). They cover months where the market was rising, peaking, falling and flat, so a model that only works in one regime shows up. Every model and feature choice below was made on these folds. I never looked at validation.csv predictions to tune anything.</w:t>
+        <w:t>I used a rolling-origin (expanding window) split. For each cutoff from 1 May to 1 Sep, the model is trained on every load before the cutoff and tested on the two calendar months after it. That gives five test windows (May-Jun through Sep-Oct). They cover months where the market was rising, peaking, falling and flat, so a model that only works in one regime shows up.</w:t>
+      </w:r>
+    </w:p>
+    <w:p>
+      <w:r>
+        <w:t>One caveat on that: every model and feature choice below was made by looking at these same five windows, so their average is a model-selection result and probably a little optimistic. I never tuned anything on validation.csv, so Spotter's scoring of Nov-Dec is the real untouched test. If I did this again I'd keep the Sep-Oct window locked until the very end and only score the final model on it once.</w:t>
       </w:r>
     </w:p>
     <w:p>
@@ -53,7 +58,12 @@
     </w:p>
     <w:p>
       <w:r>
-        <w:t>Metrics: MAPE is the main one because rates go from about $150 to over $8,000, and a $50 miss means very different things at each end. I also report MAE, RMSE and mean log bias, since a forecast that is systematically high or low is a separate problem from noisy predictions. Mislabelled rows (section 3) are excluded from the test folds too, so the numbers measure error against realistic rates.</w:t>
+        <w:t>Same-day averages. The model uses two inputs built from all loads on the same date: the mean market_index and the mean quote_signal for that day. Both are averages of input features, never of rates, and in validation they are built the same way (from every load on the test date). That still assumes the whole day's batch of loads is available when predictions are made, which is true here because validation.csv is handed over as one file. If loads had to be priced one at a time, I'd use the per-load variant (each load's own market_index, no daily averages). It scores 2.09% against 2.08%, so the results don't depend on this assumption.</w:t>
+      </w:r>
+    </w:p>
+    <w:p>
+      <w:r>
+        <w:t>Metrics. MAPE = mean of |predicted - actual| / actual over the loads in a window. MAE is the same in dollars, and RMSE weights big misses more. Bias = mean of log(predicted / actual) x 100, so negative means the model under-predicts. Each number in the tables is a simple average over the five windows. MAPE is the main metric because rates go from about $150 to over $8,000, and a $50 miss means very different things at each end. The suspicious rows from section 3 are left out of the test windows too, so these numbers measure error against realistic rates.</w:t>
       </w:r>
     </w:p>
     <w:p>
@@ -112,7 +122,7 @@
               <w:rPr>
                 <w:sz w:val="18"/>
               </w:rPr>
-              <w:t>Wrong target values</w:t>
+              <w:t>Suspicious target values</w:t>
             </w:r>
           </w:p>
         </w:tc>
@@ -125,7 +135,7 @@
               <w:rPr>
                 <w:sz w:val="18"/>
               </w:rPr>
-              <w:t>677 rows (1.4%) have a rate that is about 0.2-0.4x or 3-5x what the rest of the data says for that distance and equipment. There is nothing between 0.5x and 2x outside the main body, so these look like unit or data-entry errors, not real market moves. I flag them with an L1-loss GBM (outliers don't pull it around) where |log residual| &gt; 0.4, and drop them from training.</w:t>
+              <w:t>677 rows (1.4%) have a rate that is about 0.2-0.4x or 3-5x what the rest of the data says for that distance and equipment, with nothing in between. That pattern points to entry or unit errors rather than real market moves, though I can't confirm it from the data alone. I flag them with an L1-loss GBM (which they don't pull around) where |log residual| &gt; 0.4, and drop them from training. Keeping them in raises out-of-time MAPE on clean rows from 2.08% to 3.88%.</w:t>
             </w:r>
           </w:p>
         </w:tc>
@@ -348,7 +358,7 @@
           <w:i/>
           <w:sz w:val="18"/>
         </w:rPr>
-        <w:t>Rate per mile relative to the median for its distance band and equipment. The two small clusters far from 0 are the mislabelled rows.</w:t>
+        <w:t>Rate per mile relative to the median for its distance band and equipment. The two small clusters far from 0 are the rows I treat as likely errors.</w:t>
       </w:r>
     </w:p>
     <w:p>
@@ -366,7 +376,7 @@
     </w:p>
     <w:p>
       <w:r>
-        <w:t>The time pattern is the interesting part. The average rate level of a day follows that day's mean market_index, and on top of that there is a slow upward drift of a few percent a year. Same-day index plus a linear trend explains about 80% of the day-to-day movement in rate level. I tried lagged and smoothed versions of the index and they added nothing.</w:t>
+        <w:t>The time pattern is the interesting part. I took the residuals of a model with no time inputs and averaged them per day, giving one 'rate level' number for each of the 304 training days. Regressing that daily level on the same-day mean market_index plus a linear time trend gives R-squared of about 0.80. To be clear, that is 80% of the variation in daily average levels, not 80% of the variance of individual loads. The trend works out to roughly 3-5% a year depending on how it's estimated, but it comes from ten months of data, so I treat it as an observed drift rather than established annual growth. Lagged and smoothed versions of the index added nothing.</w:t>
       </w:r>
     </w:p>
     <w:p>
@@ -436,6 +446,11 @@
     <w:p>
       <w:r>
         <w:t>So I split the model in two. The GBM handles the load-level structure, which is genuinely non-linear (the distance taper, equipment premiums, regional differences, and quote_signal mattering mostly on short hauls). A linear term on log(rate) takes the daily market index, the daily mean quote_signal and a time trend. The two parts are fitted by backfitting: fit the GBM on the target minus the linear part, refit the linear part on the GBM residuals, and repeat three times. Lanes are described by coordinates instead of city IDs, so the new validation cities borrow from nearby cities instead of falling back to a global average.</w:t>
+      </w:r>
+    </w:p>
+    <w:p>
+      <w:r>
+        <w:t>The last change I made was adding the daily mean quote_signal to the linear part. Average MAPE went from 2.10% to 2.08%. That is a small gain, about 1% relative, but it improved all five windows, so I kept it. The windows overlap, though, so they aren't five independent confirmations.</w:t>
       </w:r>
     </w:p>
     <w:p>
@@ -747,6 +762,73 @@
               <w:rPr>
                 <w:sz w:val="18"/>
               </w:rPr>
+              <w:t>GBM + linear term, per-load inputs (no same-day averages)</w:t>
+            </w:r>
+          </w:p>
+        </w:tc>
+        <w:tc>
+          <w:tcPr>
+            <w:tcW w:type="dxa" w:w="1728"/>
+          </w:tcPr>
+          <w:p>
+            <w:r>
+              <w:rPr>
+                <w:sz w:val="18"/>
+              </w:rPr>
+              <w:t>2.09</w:t>
+            </w:r>
+          </w:p>
+        </w:tc>
+        <w:tc>
+          <w:tcPr>
+            <w:tcW w:type="dxa" w:w="1728"/>
+          </w:tcPr>
+          <w:p>
+            <w:r>
+              <w:rPr>
+                <w:sz w:val="18"/>
+              </w:rPr>
+              <w:t>48.57</w:t>
+            </w:r>
+          </w:p>
+        </w:tc>
+        <w:tc>
+          <w:tcPr>
+            <w:tcW w:type="dxa" w:w="1728"/>
+          </w:tcPr>
+          <w:p>
+            <w:r>
+              <w:rPr>
+                <w:sz w:val="18"/>
+              </w:rPr>
+              <w:t>77.75</w:t>
+            </w:r>
+          </w:p>
+        </w:tc>
+        <w:tc>
+          <w:tcPr>
+            <w:tcW w:type="dxa" w:w="1728"/>
+          </w:tcPr>
+          <w:p>
+            <w:r>
+              <w:rPr>
+                <w:sz w:val="18"/>
+              </w:rPr>
+              <w:t>-0.31</w:t>
+            </w:r>
+          </w:p>
+        </w:tc>
+      </w:tr>
+      <w:tr>
+        <w:tc>
+          <w:tcPr>
+            <w:tcW w:type="dxa" w:w="1728"/>
+          </w:tcPr>
+          <w:p>
+            <w:r>
+              <w:rPr>
+                <w:sz w:val="18"/>
+              </w:rPr>
               <w:t>GBM + linear market/trend offset *</w:t>
             </w:r>
           </w:p>
@@ -818,16 +900,17 @@
         <w:tblLook w:firstColumn="1" w:firstRow="1" w:lastColumn="0" w:lastRow="0" w:noHBand="0" w:noVBand="1" w:val="04A0"/>
       </w:tblPr>
       <w:tblGrid>
-        <w:gridCol w:w="1728"/>
-        <w:gridCol w:w="1728"/>
-        <w:gridCol w:w="1728"/>
-        <w:gridCol w:w="1728"/>
-        <w:gridCol w:w="1728"/>
+        <w:gridCol w:w="1440"/>
+        <w:gridCol w:w="1440"/>
+        <w:gridCol w:w="1440"/>
+        <w:gridCol w:w="1440"/>
+        <w:gridCol w:w="1440"/>
+        <w:gridCol w:w="1440"/>
       </w:tblGrid>
       <w:tr>
         <w:tc>
           <w:tcPr>
-            <w:tcW w:type="dxa" w:w="1728"/>
+            <w:tcW w:type="dxa" w:w="1440"/>
           </w:tcPr>
           <w:p>
             <w:r>
@@ -840,7 +923,7 @@
         </w:tc>
         <w:tc>
           <w:tcPr>
-            <w:tcW w:type="dxa" w:w="1728"/>
+            <w:tcW w:type="dxa" w:w="1440"/>
           </w:tcPr>
           <w:p>
             <w:r>
@@ -853,7 +936,20 @@
         </w:tc>
         <w:tc>
           <w:tcPr>
-            <w:tcW w:type="dxa" w:w="1728"/>
+            <w:tcW w:type="dxa" w:w="1440"/>
+          </w:tcPr>
+          <w:p>
+            <w:r>
+              <w:rPr>
+                <w:sz w:val="18"/>
+              </w:rPr>
+              <w:t>GBM + linear, per-load</w:t>
+            </w:r>
+          </w:p>
+        </w:tc>
+        <w:tc>
+          <w:tcPr>
+            <w:tcW w:type="dxa" w:w="1440"/>
           </w:tcPr>
           <w:p>
             <w:r>
@@ -866,7 +962,7 @@
         </w:tc>
         <w:tc>
           <w:tcPr>
-            <w:tcW w:type="dxa" w:w="1728"/>
+            <w:tcW w:type="dxa" w:w="1440"/>
           </w:tcPr>
           <w:p>
             <w:r>
@@ -879,7 +975,7 @@
         </w:tc>
         <w:tc>
           <w:tcPr>
-            <w:tcW w:type="dxa" w:w="1728"/>
+            <w:tcW w:type="dxa" w:w="1440"/>
           </w:tcPr>
           <w:p>
             <w:r>
@@ -894,7 +990,7 @@
       <w:tr>
         <w:tc>
           <w:tcPr>
-            <w:tcW w:type="dxa" w:w="1728"/>
+            <w:tcW w:type="dxa" w:w="1440"/>
           </w:tcPr>
           <w:p>
             <w:r>
@@ -907,7 +1003,7 @@
         </w:tc>
         <w:tc>
           <w:tcPr>
-            <w:tcW w:type="dxa" w:w="1728"/>
+            <w:tcW w:type="dxa" w:w="1440"/>
           </w:tcPr>
           <w:p>
             <w:r>
@@ -920,7 +1016,20 @@
         </w:tc>
         <w:tc>
           <w:tcPr>
-            <w:tcW w:type="dxa" w:w="1728"/>
+            <w:tcW w:type="dxa" w:w="1440"/>
+          </w:tcPr>
+          <w:p>
+            <w:r>
+              <w:rPr>
+                <w:sz w:val="18"/>
+              </w:rPr>
+              <w:t>1.70</w:t>
+            </w:r>
+          </w:p>
+        </w:tc>
+        <w:tc>
+          <w:tcPr>
+            <w:tcW w:type="dxa" w:w="1440"/>
           </w:tcPr>
           <w:p>
             <w:r>
@@ -933,7 +1042,7 @@
         </w:tc>
         <w:tc>
           <w:tcPr>
-            <w:tcW w:type="dxa" w:w="1728"/>
+            <w:tcW w:type="dxa" w:w="1440"/>
           </w:tcPr>
           <w:p>
             <w:r>
@@ -946,7 +1055,7 @@
         </w:tc>
         <w:tc>
           <w:tcPr>
-            <w:tcW w:type="dxa" w:w="1728"/>
+            <w:tcW w:type="dxa" w:w="1440"/>
           </w:tcPr>
           <w:p>
             <w:r>
@@ -961,7 +1070,7 @@
       <w:tr>
         <w:tc>
           <w:tcPr>
-            <w:tcW w:type="dxa" w:w="1728"/>
+            <w:tcW w:type="dxa" w:w="1440"/>
           </w:tcPr>
           <w:p>
             <w:r>
@@ -974,7 +1083,7 @@
         </w:tc>
         <w:tc>
           <w:tcPr>
-            <w:tcW w:type="dxa" w:w="1728"/>
+            <w:tcW w:type="dxa" w:w="1440"/>
           </w:tcPr>
           <w:p>
             <w:r>
@@ -987,7 +1096,20 @@
         </w:tc>
         <w:tc>
           <w:tcPr>
-            <w:tcW w:type="dxa" w:w="1728"/>
+            <w:tcW w:type="dxa" w:w="1440"/>
+          </w:tcPr>
+          <w:p>
+            <w:r>
+              <w:rPr>
+                <w:sz w:val="18"/>
+              </w:rPr>
+              <w:t>1.63</w:t>
+            </w:r>
+          </w:p>
+        </w:tc>
+        <w:tc>
+          <w:tcPr>
+            <w:tcW w:type="dxa" w:w="1440"/>
           </w:tcPr>
           <w:p>
             <w:r>
@@ -1000,7 +1122,7 @@
         </w:tc>
         <w:tc>
           <w:tcPr>
-            <w:tcW w:type="dxa" w:w="1728"/>
+            <w:tcW w:type="dxa" w:w="1440"/>
           </w:tcPr>
           <w:p>
             <w:r>
@@ -1013,7 +1135,7 @@
         </w:tc>
         <w:tc>
           <w:tcPr>
-            <w:tcW w:type="dxa" w:w="1728"/>
+            <w:tcW w:type="dxa" w:w="1440"/>
           </w:tcPr>
           <w:p>
             <w:r>
@@ -1028,7 +1150,7 @@
       <w:tr>
         <w:tc>
           <w:tcPr>
-            <w:tcW w:type="dxa" w:w="1728"/>
+            <w:tcW w:type="dxa" w:w="1440"/>
           </w:tcPr>
           <w:p>
             <w:r>
@@ -1041,7 +1163,7 @@
         </w:tc>
         <w:tc>
           <w:tcPr>
-            <w:tcW w:type="dxa" w:w="1728"/>
+            <w:tcW w:type="dxa" w:w="1440"/>
           </w:tcPr>
           <w:p>
             <w:r>
@@ -1054,7 +1176,20 @@
         </w:tc>
         <w:tc>
           <w:tcPr>
-            <w:tcW w:type="dxa" w:w="1728"/>
+            <w:tcW w:type="dxa" w:w="1440"/>
+          </w:tcPr>
+          <w:p>
+            <w:r>
+              <w:rPr>
+                <w:sz w:val="18"/>
+              </w:rPr>
+              <w:t>2.93</w:t>
+            </w:r>
+          </w:p>
+        </w:tc>
+        <w:tc>
+          <w:tcPr>
+            <w:tcW w:type="dxa" w:w="1440"/>
           </w:tcPr>
           <w:p>
             <w:r>
@@ -1067,7 +1202,7 @@
         </w:tc>
         <w:tc>
           <w:tcPr>
-            <w:tcW w:type="dxa" w:w="1728"/>
+            <w:tcW w:type="dxa" w:w="1440"/>
           </w:tcPr>
           <w:p>
             <w:r>
@@ -1080,7 +1215,7 @@
         </w:tc>
         <w:tc>
           <w:tcPr>
-            <w:tcW w:type="dxa" w:w="1728"/>
+            <w:tcW w:type="dxa" w:w="1440"/>
           </w:tcPr>
           <w:p>
             <w:r>
@@ -1095,7 +1230,7 @@
       <w:tr>
         <w:tc>
           <w:tcPr>
-            <w:tcW w:type="dxa" w:w="1728"/>
+            <w:tcW w:type="dxa" w:w="1440"/>
           </w:tcPr>
           <w:p>
             <w:r>
@@ -1108,7 +1243,7 @@
         </w:tc>
         <w:tc>
           <w:tcPr>
-            <w:tcW w:type="dxa" w:w="1728"/>
+            <w:tcW w:type="dxa" w:w="1440"/>
           </w:tcPr>
           <w:p>
             <w:r>
@@ -1121,7 +1256,20 @@
         </w:tc>
         <w:tc>
           <w:tcPr>
-            <w:tcW w:type="dxa" w:w="1728"/>
+            <w:tcW w:type="dxa" w:w="1440"/>
+          </w:tcPr>
+          <w:p>
+            <w:r>
+              <w:rPr>
+                <w:sz w:val="18"/>
+              </w:rPr>
+              <w:t>2.62</w:t>
+            </w:r>
+          </w:p>
+        </w:tc>
+        <w:tc>
+          <w:tcPr>
+            <w:tcW w:type="dxa" w:w="1440"/>
           </w:tcPr>
           <w:p>
             <w:r>
@@ -1134,7 +1282,7 @@
         </w:tc>
         <w:tc>
           <w:tcPr>
-            <w:tcW w:type="dxa" w:w="1728"/>
+            <w:tcW w:type="dxa" w:w="1440"/>
           </w:tcPr>
           <w:p>
             <w:r>
@@ -1147,7 +1295,7 @@
         </w:tc>
         <w:tc>
           <w:tcPr>
-            <w:tcW w:type="dxa" w:w="1728"/>
+            <w:tcW w:type="dxa" w:w="1440"/>
           </w:tcPr>
           <w:p>
             <w:r>
@@ -1162,7 +1310,7 @@
       <w:tr>
         <w:tc>
           <w:tcPr>
-            <w:tcW w:type="dxa" w:w="1728"/>
+            <w:tcW w:type="dxa" w:w="1440"/>
           </w:tcPr>
           <w:p>
             <w:r>
@@ -1175,7 +1323,7 @@
         </w:tc>
         <w:tc>
           <w:tcPr>
-            <w:tcW w:type="dxa" w:w="1728"/>
+            <w:tcW w:type="dxa" w:w="1440"/>
           </w:tcPr>
           <w:p>
             <w:r>
@@ -1188,7 +1336,20 @@
         </w:tc>
         <w:tc>
           <w:tcPr>
-            <w:tcW w:type="dxa" w:w="1728"/>
+            <w:tcW w:type="dxa" w:w="1440"/>
+          </w:tcPr>
+          <w:p>
+            <w:r>
+              <w:rPr>
+                <w:sz w:val="18"/>
+              </w:rPr>
+              <w:t>1.59</w:t>
+            </w:r>
+          </w:p>
+        </w:tc>
+        <w:tc>
+          <w:tcPr>
+            <w:tcW w:type="dxa" w:w="1440"/>
           </w:tcPr>
           <w:p>
             <w:r>
@@ -1201,7 +1362,7 @@
         </w:tc>
         <w:tc>
           <w:tcPr>
-            <w:tcW w:type="dxa" w:w="1728"/>
+            <w:tcW w:type="dxa" w:w="1440"/>
           </w:tcPr>
           <w:p>
             <w:r>
@@ -1214,7 +1375,7 @@
         </w:tc>
         <w:tc>
           <w:tcPr>
-            <w:tcW w:type="dxa" w:w="1728"/>
+            <w:tcW w:type="dxa" w:w="1440"/>
           </w:tcPr>
           <w:p>
             <w:r>
@@ -1230,7 +1391,194 @@
     <w:p/>
     <w:p>
       <w:r>
-        <w:t>The final model is best in 4 of 5 windows and has the smallest bias. The one window it doesn't win is Sep-Oct. There the market sat close to its January level, so ignoring it cost nothing. The biggest errors for every model are in Jul-Aug, where there is a level drop around 25 July that the market index doesn't fully explain, and August loads are noisier in general. To see how much of the error is timing, I replaced the predicted daily level with the true one. That only brought MAPE down to about 2.0%, so most of what's left is load-level noise rather than the market level.</w:t>
+        <w:t>The final model is best in 4 of 5 windows and has the smallest bias. The one window it doesn't win is Sep-Oct. There the market sat close to its January level, so ignoring it cost nothing. The biggest errors for every model are in Jul-Aug, where there is a level drop around 25 July that the market index doesn't fully explain, and August loads are noisier in general.</w:t>
+      </w:r>
+    </w:p>
+    <w:p>
+      <w:r>
+        <w:t>Extra checks on the same windows:</w:t>
+      </w:r>
+    </w:p>
+    <w:tbl>
+      <w:tblPr>
+        <w:tblStyle w:val="LightGrid-Accent1"/>
+        <w:tblW w:type="auto" w:w="0"/>
+        <w:tblLook w:firstColumn="1" w:firstRow="1" w:lastColumn="0" w:lastRow="0" w:noHBand="0" w:noVBand="1" w:val="04A0"/>
+      </w:tblPr>
+      <w:tblGrid>
+        <w:gridCol w:w="2880"/>
+        <w:gridCol w:w="2880"/>
+        <w:gridCol w:w="2880"/>
+      </w:tblGrid>
+      <w:tr>
+        <w:tc>
+          <w:tcPr>
+            <w:tcW w:type="dxa" w:w="2880"/>
+          </w:tcPr>
+          <w:p>
+            <w:r>
+              <w:rPr>
+                <w:sz w:val="18"/>
+              </w:rPr>
+              <w:t>Variant (same 5 windows, clean test rows)</w:t>
+            </w:r>
+          </w:p>
+        </w:tc>
+        <w:tc>
+          <w:tcPr>
+            <w:tcW w:type="dxa" w:w="2880"/>
+          </w:tcPr>
+          <w:p>
+            <w:r>
+              <w:rPr>
+                <w:sz w:val="18"/>
+              </w:rPr>
+              <w:t>MAPE %</w:t>
+            </w:r>
+          </w:p>
+        </w:tc>
+        <w:tc>
+          <w:tcPr>
+            <w:tcW w:type="dxa" w:w="2880"/>
+          </w:tcPr>
+          <w:p>
+            <w:r>
+              <w:rPr>
+                <w:sz w:val="18"/>
+              </w:rPr>
+              <w:t>MAE $</w:t>
+            </w:r>
+          </w:p>
+        </w:tc>
+      </w:tr>
+      <w:tr>
+        <w:tc>
+          <w:tcPr>
+            <w:tcW w:type="dxa" w:w="2880"/>
+          </w:tcPr>
+          <w:p>
+            <w:r>
+              <w:rPr>
+                <w:sz w:val="18"/>
+              </w:rPr>
+              <w:t>Final model</w:t>
+            </w:r>
+          </w:p>
+        </w:tc>
+        <w:tc>
+          <w:tcPr>
+            <w:tcW w:type="dxa" w:w="2880"/>
+          </w:tcPr>
+          <w:p>
+            <w:r>
+              <w:rPr>
+                <w:sz w:val="18"/>
+              </w:rPr>
+              <w:t>2.08</w:t>
+            </w:r>
+          </w:p>
+        </w:tc>
+        <w:tc>
+          <w:tcPr>
+            <w:tcW w:type="dxa" w:w="2880"/>
+          </w:tcPr>
+          <w:p>
+            <w:r>
+              <w:rPr>
+                <w:sz w:val="18"/>
+              </w:rPr>
+              <w:t>47.97</w:t>
+            </w:r>
+          </w:p>
+        </w:tc>
+      </w:tr>
+      <w:tr>
+        <w:tc>
+          <w:tcPr>
+            <w:tcW w:type="dxa" w:w="2880"/>
+          </w:tcPr>
+          <w:p>
+            <w:r>
+              <w:rPr>
+                <w:sz w:val="18"/>
+              </w:rPr>
+              <w:t>Same model, per-load inputs only (no same-day averages)</w:t>
+            </w:r>
+          </w:p>
+        </w:tc>
+        <w:tc>
+          <w:tcPr>
+            <w:tcW w:type="dxa" w:w="2880"/>
+          </w:tcPr>
+          <w:p>
+            <w:r>
+              <w:rPr>
+                <w:sz w:val="18"/>
+              </w:rPr>
+              <w:t>2.09</w:t>
+            </w:r>
+          </w:p>
+        </w:tc>
+        <w:tc>
+          <w:tcPr>
+            <w:tcW w:type="dxa" w:w="2880"/>
+          </w:tcPr>
+          <w:p>
+            <w:r>
+              <w:rPr>
+                <w:sz w:val="18"/>
+              </w:rPr>
+              <w:t>48.57</w:t>
+            </w:r>
+          </w:p>
+        </w:tc>
+      </w:tr>
+      <w:tr>
+        <w:tc>
+          <w:tcPr>
+            <w:tcW w:type="dxa" w:w="2880"/>
+          </w:tcPr>
+          <w:p>
+            <w:r>
+              <w:rPr>
+                <w:sz w:val="18"/>
+              </w:rPr>
+              <w:t>Final model trained with the suspicious rates kept</w:t>
+            </w:r>
+          </w:p>
+        </w:tc>
+        <w:tc>
+          <w:tcPr>
+            <w:tcW w:type="dxa" w:w="2880"/>
+          </w:tcPr>
+          <w:p>
+            <w:r>
+              <w:rPr>
+                <w:sz w:val="18"/>
+              </w:rPr>
+              <w:t>3.88</w:t>
+            </w:r>
+          </w:p>
+        </w:tc>
+        <w:tc>
+          <w:tcPr>
+            <w:tcW w:type="dxa" w:w="2880"/>
+          </w:tcPr>
+          <w:p>
+            <w:r>
+              <w:rPr>
+                <w:sz w:val="18"/>
+              </w:rPr>
+              <w:t>86.08</w:t>
+            </w:r>
+          </w:p>
+        </w:tc>
+      </w:tr>
+    </w:tbl>
+    <w:p/>
+    <w:p>
+      <w:r>
+        <w:t>One more diagnostic. To see how much of the remaining error is about getting each day's overall level right, I shifted every test day's predictions by that day's true average error. This uses the test labels, so it can't be done at prediction time and isn't a lower bound on the error. It only brought MAPE to 1.97%, which tells me most of the remaining error is load-to-load variation within a day, not the market level.</w:t>
       </w:r>
     </w:p>
     <w:p>

</xml_diff>